<commit_message>
CED: no parecer V.2, município para a titularidade, câmara para a competência
O município é a pessoa coletiva (n.º 2 do art.º 235.º da Constituição) e é
ele que pode ser titular. A câmara municipal é um órgão (art.º 250.º) e tem
competências, não personalidade. O registo no SIAC faz-se, por isso, em nome
do município, que é também o titular do NIPC usado no sistema. É a forma que
o legislador açoriano usou no n.º 13 do art.º 6.º-B do DLR n.º 12/2016/A.

Acrescentado um parágrafo de uma frase a explicar a distinção, e corrigidas
as quatro passagens onde se dizia «em nome da câmara municipal». Mantém-se
«câmara municipal» onde se trata de competência: autorizar, parecer do
médico veterinário municipal, medidas corretivas e recolha.

Co-Authored-By: Claude Opus 5 <noreply@anthropic.com>
Claude-Session: https://claude.ai/code/session_013o6nFXHLT8N1RQUQEcwmnG
</commit_message>
<xml_diff>
--- a/CED/Parecer_CED_CAEDS_V2.docx
+++ b/CED/Parecer_CED_CAEDS_V2.docx
@@ -35,7 +35,7 @@
           <w:b w:val="0"/>
           <w:color w:val="000000"/>
         </w:rPr>
-        <w:t>Em resumo: o animal inserido num programa CED é um animal errante e deve ser registado no Sistema de Informação de Animais de Companhia em nome da câmara municipal. O voluntário que cuida da colónia é detentor, não titular.</w:t>
+        <w:t>Em resumo: o animal inserido num programa CED é um animal errante e deve ser registado no Sistema de Informação de Animais de Companhia em nome do município. O voluntário que cuida da colónia é detentor, não titular.</w:t>
       </w:r>
     </w:p>
     <w:p>
@@ -84,6 +84,18 @@
           <w:color w:val="000000"/>
         </w:rPr>
         <w:t>A colónia existe, por isso, por autorização da câmara municipal. O n.º 2 do mesmo artigo permite que a câmara atribua a gestão do programa a uma organização de proteção animal, mediante proposta desta. Atribuir a gestão não é transferir a titularidade dos animais.</w:t>
+      </w:r>
+    </w:p>
+    <w:p>
+      <w:pPr>
+        <w:jc w:val="both"/>
+      </w:pPr>
+      <w:r>
+        <w:rPr>
+          <w:b w:val="0"/>
+          <w:color w:val="000000"/>
+        </w:rPr>
+        <w:t>Uma precisão de linguagem, que importa para o registo. A titularidade é do município, que é a pessoa coletiva. A câmara municipal é o órgão que exerce as competências. É por isso que o registo no SIAC se faz em nome do município, e não do órgão.</w:t>
       </w:r>
     </w:p>
     <w:p>
@@ -170,7 +182,7 @@
           <w:b w:val="0"/>
           <w:color w:val="000000"/>
         </w:rPr>
-        <w:t>Não havendo proprietário conhecido, é registado em nome do titular desse centro, que é a câmara municipal.</w:t>
+        <w:t>Não havendo proprietário conhecido, é registado em nome do titular desse centro, que é o município.</w:t>
       </w:r>
     </w:p>
     <w:p>
@@ -242,7 +254,7 @@
           <w:b w:val="0"/>
           <w:color w:val="000000"/>
         </w:rPr>
-        <w:t>Em nome da câmara municipal.</w:t>
+        <w:t>Em nome do município.</w:t>
       </w:r>
     </w:p>
     <w:p>
@@ -266,7 +278,7 @@
           <w:b w:val="0"/>
           <w:color w:val="000000"/>
         </w:rPr>
-        <w:t>Sim quanto à Câmara Municipal de Silves. Não quanto à junta de freguesia. A competência para autorizar as colónias é da câmara municipal, sob parecer do médico veterinário municipal, e o animal passa pelo centro de recolha oficial, que é municipal. A junta de freguesia pode colaborar, inclusive por delegação de competências do município nos termos da Lei n.º 75/2013, de 12 de setembro, mas essa colaboração não transfere a titularidade dos animais, pela mesma razão que a atribuição da gestão a uma organização de proteção animal também não transfere.</w:t>
+        <w:t>Sim. O registo faz-se em nome do Município de Silves. Não em nome da junta de freguesia. A competência para autorizar as colónias é da câmara municipal, sob parecer do médico veterinário municipal, e o animal passa pelo centro de recolha oficial, que é municipal. A junta de freguesia pode colaborar, inclusive por delegação de competências do município nos termos da Lei n.º 75/2013, de 12 de setembro, mas essa colaboração não transfere a titularidade dos animais, pela mesma razão que a atribuição da gestão a uma organização de proteção animal também não transfere.</w:t>
       </w:r>
     </w:p>
     <w:p>
@@ -326,7 +338,7 @@
           <w:b w:val="0"/>
           <w:color w:val="000000"/>
         </w:rPr>
-        <w:t>Requerer à Câmara Municipal de Silves a autorização das colónias ao abrigo do n.º 1 do art.º 9.º da Portaria n.º 146/2017, com identificação dos locais e dos voluntários responsáveis pela execução no plano de gestão de cada colónia. Autorizado o programa, os animais são identificados, esterilizados e registados em nome da câmara municipal.</w:t>
+        <w:t>Requerer à Câmara Municipal de Silves a autorização das colónias ao abrigo do n.º 1 do art.º 9.º da Portaria n.º 146/2017, com identificação dos locais e dos voluntários responsáveis pela execução no plano de gestão de cada colónia. Autorizado o programa, os animais são identificados, esterilizados e registados em nome do município.</w:t>
       </w:r>
     </w:p>
     <w:p>

</xml_diff>